<commit_message>
Serve the site at jundaz.github.io
The repository now lives in the jundaz organization, so GitHub Pages
serves it as a user site at the root of https://jundaz.github.io/.
Update url, baseurl, and repository in _config.yml, and the website
link in the CV header.

Co-Authored-By: Claude Opus 5.5 <noreply@anthropic.com>
</commit_message>
<xml_diff>
--- a/jundazhao_CV.docx
+++ b/jundazhao_CV.docx
@@ -50,7 +50,7 @@
         </w:rPr>
         <w:t xml:space="preserve">Toronto, ON, Canada  •  </w:t>
       </w:r>
-      <w:hyperlink w:history="1" r:id="rIdvpcaiobfo7wdew9afra5r">
+      <w:hyperlink w:history="1" r:id="rId_pygsi5zuvu4cukypmus1">
         <w:r>
           <w:rPr>
             <w:rFonts w:ascii="Times New Roman" w:cs="Times New Roman" w:eastAsia="Times New Roman" w:hAnsi="Times New Roman"/>
@@ -69,7 +69,7 @@
         </w:rPr>
         <w:t xml:space="preserve">  •  </w:t>
       </w:r>
-      <w:hyperlink w:history="1" r:id="rIduozkbt5kpcovwaxfheq0n">
+      <w:hyperlink w:history="1" r:id="rIdzhhmpeyjy5exrg0vz7b0z">
         <w:r>
           <w:rPr>
             <w:rFonts w:ascii="Times New Roman" w:cs="Times New Roman" w:eastAsia="Times New Roman" w:hAnsi="Times New Roman"/>
@@ -77,7 +77,7 @@
             <w:sz w:val="18"/>
             <w:szCs w:val="18"/>
           </w:rPr>
-          <w:t xml:space="preserve">drixs2050.github.io/jundaz.github.io</w:t>
+          <w:t xml:space="preserve">jundaz.github.io</w:t>
         </w:r>
       </w:hyperlink>
     </w:p>
@@ -86,7 +86,7 @@
         <w:spacing w:after="0"/>
         <w:jc w:val="center"/>
       </w:pPr>
-      <w:hyperlink w:history="1" r:id="rIdxwak4nwueidobw4yodipl">
+      <w:hyperlink w:history="1" r:id="rId01-1jbgp7mxhrwy6ii4qh">
         <w:r>
           <w:rPr>
             <w:rFonts w:ascii="Times New Roman" w:cs="Times New Roman" w:eastAsia="Times New Roman" w:hAnsi="Times New Roman"/>
@@ -105,7 +105,7 @@
         </w:rPr>
         <w:t xml:space="preserve">  •  </w:t>
       </w:r>
-      <w:hyperlink w:history="1" r:id="rIdzhh55jk15pdwu-1fhrjev">
+      <w:hyperlink w:history="1" r:id="rIdyjnd3azcqycromt3o6goc">
         <w:r>
           <w:rPr>
             <w:rFonts w:ascii="Times New Roman" w:cs="Times New Roman" w:eastAsia="Times New Roman" w:hAnsi="Times New Roman"/>
@@ -124,7 +124,7 @@
         </w:rPr>
         <w:t xml:space="preserve">  •  </w:t>
       </w:r>
-      <w:hyperlink w:history="1" r:id="rIdg4xdd8debib0c8wy1hz0a">
+      <w:hyperlink w:history="1" r:id="rIdh8ajgjj_hcdiud0swwrv0">
         <w:r>
           <w:rPr>
             <w:rFonts w:ascii="Times New Roman" w:cs="Times New Roman" w:eastAsia="Times New Roman" w:hAnsi="Times New Roman"/>
@@ -709,7 +709,7 @@
         </w:rPr>
         <w:t xml:space="preserve"> </w:t>
       </w:r>
-      <w:hyperlink w:history="1" r:id="rId7ehkyyisqifswj3nuqhxc">
+      <w:hyperlink w:history="1" r:id="rIdjgpveiw7jsedwtjmiilx6">
         <w:r>
           <w:rPr>
             <w:rFonts w:ascii="Times New Roman" w:cs="Times New Roman" w:eastAsia="Times New Roman" w:hAnsi="Times New Roman"/>
@@ -773,7 +773,7 @@
         </w:rPr>
         <w:t xml:space="preserve">. </w:t>
       </w:r>
-      <w:hyperlink w:history="1" r:id="rIdb8-bd9zjyq6lm5p5rw3ds">
+      <w:hyperlink w:history="1" r:id="rIddxbrhss-9itprfmaagup8">
         <w:r>
           <w:rPr>
             <w:rFonts w:ascii="Times New Roman" w:cs="Times New Roman" w:eastAsia="Times New Roman" w:hAnsi="Times New Roman"/>
@@ -837,7 +837,7 @@
         </w:rPr>
         <w:t xml:space="preserve">, 2025. </w:t>
       </w:r>
-      <w:hyperlink w:history="1" r:id="rIdtg0yoauqrmoa99mnsrfbn">
+      <w:hyperlink w:history="1" r:id="rIdrrwsunzyigdl74920vqxg">
         <w:r>
           <w:rPr>
             <w:rFonts w:ascii="Times New Roman" w:cs="Times New Roman" w:eastAsia="Times New Roman" w:hAnsi="Times New Roman"/>
@@ -917,7 +917,7 @@
         </w:rPr>
         <w:t xml:space="preserve"> </w:t>
       </w:r>
-      <w:hyperlink w:history="1" r:id="rIdkw2mwxdac6gtmfapve72p">
+      <w:hyperlink w:history="1" r:id="rIdlwyg26s8h-x0h4yqxqxqi">
         <w:r>
           <w:rPr>
             <w:rFonts w:ascii="Times New Roman" w:cs="Times New Roman" w:eastAsia="Times New Roman" w:hAnsi="Times New Roman"/>
@@ -981,7 +981,7 @@
         </w:rPr>
         <w:t xml:space="preserve">. </w:t>
       </w:r>
-      <w:hyperlink w:history="1" r:id="rId0toartofwrquspvbh0kcy">
+      <w:hyperlink w:history="1" r:id="rIdhweu32izmjkmufwybs6et">
         <w:r>
           <w:rPr>
             <w:rFonts w:ascii="Times New Roman" w:cs="Times New Roman" w:eastAsia="Times New Roman" w:hAnsi="Times New Roman"/>
@@ -1268,7 +1268,7 @@
         </w:rPr>
         <w:t xml:space="preserve">Released public replication packages for both ISSTA 2026 papers on GitHub, archived on Zenodo (</w:t>
       </w:r>
-      <w:hyperlink w:history="1" r:id="rIdrgm5s1xko2dfwcgbngys8">
+      <w:hyperlink w:history="1" r:id="rIdzih09-inu5tv7nock8ygl">
         <w:r>
           <w:rPr>
             <w:rFonts w:ascii="Times New Roman" w:cs="Times New Roman" w:eastAsia="Times New Roman" w:hAnsi="Times New Roman"/>
@@ -1287,7 +1287,7 @@
         </w:rPr>
         <w:t xml:space="preserve">, </w:t>
       </w:r>
-      <w:hyperlink w:history="1" r:id="rId2myh9c7tvxta38dbgtsic">
+      <w:hyperlink w:history="1" r:id="rIdcvmnkftsmoq1ug4gzfcb5">
         <w:r>
           <w:rPr>
             <w:rFonts w:ascii="Times New Roman" w:cs="Times New Roman" w:eastAsia="Times New Roman" w:hAnsi="Times New Roman"/>

</xml_diff>

<commit_message>
Say postdoc start is late 2027
Co-Authored-By: Claude Opus 5.5 <noreply@anthropic.com>
</commit_message>
<xml_diff>
--- a/jundazhao_CV.docx
+++ b/jundazhao_CV.docx
@@ -50,7 +50,7 @@
         </w:rPr>
         <w:t xml:space="preserve">Toronto, ON, Canada  •  </w:t>
       </w:r>
-      <w:hyperlink w:history="1" r:id="rId_pygsi5zuvu4cukypmus1">
+      <w:hyperlink w:history="1" r:id="rIdv5ztptguys9s3vldlwip-">
         <w:r>
           <w:rPr>
             <w:rFonts w:ascii="Times New Roman" w:cs="Times New Roman" w:eastAsia="Times New Roman" w:hAnsi="Times New Roman"/>
@@ -69,7 +69,7 @@
         </w:rPr>
         <w:t xml:space="preserve">  •  </w:t>
       </w:r>
-      <w:hyperlink w:history="1" r:id="rIdzhhmpeyjy5exrg0vz7b0z">
+      <w:hyperlink w:history="1" r:id="rIdike9xodtvmgrcmrekjnwx">
         <w:r>
           <w:rPr>
             <w:rFonts w:ascii="Times New Roman" w:cs="Times New Roman" w:eastAsia="Times New Roman" w:hAnsi="Times New Roman"/>
@@ -86,7 +86,7 @@
         <w:spacing w:after="0"/>
         <w:jc w:val="center"/>
       </w:pPr>
-      <w:hyperlink w:history="1" r:id="rId01-1jbgp7mxhrwy6ii4qh">
+      <w:hyperlink w:history="1" r:id="rId0vhyhzby-vpwky-q6vfix">
         <w:r>
           <w:rPr>
             <w:rFonts w:ascii="Times New Roman" w:cs="Times New Roman" w:eastAsia="Times New Roman" w:hAnsi="Times New Roman"/>
@@ -105,7 +105,7 @@
         </w:rPr>
         <w:t xml:space="preserve">  •  </w:t>
       </w:r>
-      <w:hyperlink w:history="1" r:id="rIdyjnd3azcqycromt3o6goc">
+      <w:hyperlink w:history="1" r:id="rIdh6lxz0yaeprjuaohh7bis">
         <w:r>
           <w:rPr>
             <w:rFonts w:ascii="Times New Roman" w:cs="Times New Roman" w:eastAsia="Times New Roman" w:hAnsi="Times New Roman"/>
@@ -124,7 +124,7 @@
         </w:rPr>
         <w:t xml:space="preserve">  •  </w:t>
       </w:r>
-      <w:hyperlink w:history="1" r:id="rIdh8ajgjj_hcdiud0swwrv0">
+      <w:hyperlink w:history="1" r:id="rId5efxfuys9jysvkxrzvpn7">
         <w:r>
           <w:rPr>
             <w:rFonts w:ascii="Times New Roman" w:cs="Times New Roman" w:eastAsia="Times New Roman" w:hAnsi="Times New Roman"/>
@@ -173,7 +173,7 @@
           <w:sz w:val="20"/>
           <w:szCs w:val="20"/>
         </w:rPr>
-        <w:t xml:space="preserve">Seeking a postdoctoral position starting September 2027.</w:t>
+        <w:t xml:space="preserve">Seeking a postdoctoral position starting in late 2027.</w:t>
       </w:r>
     </w:p>
     <w:p>
@@ -709,7 +709,7 @@
         </w:rPr>
         <w:t xml:space="preserve"> </w:t>
       </w:r>
-      <w:hyperlink w:history="1" r:id="rIdjgpveiw7jsedwtjmiilx6">
+      <w:hyperlink w:history="1" r:id="rIdqgnevqlipucvasz267sla">
         <w:r>
           <w:rPr>
             <w:rFonts w:ascii="Times New Roman" w:cs="Times New Roman" w:eastAsia="Times New Roman" w:hAnsi="Times New Roman"/>
@@ -773,7 +773,7 @@
         </w:rPr>
         <w:t xml:space="preserve">. </w:t>
       </w:r>
-      <w:hyperlink w:history="1" r:id="rIddxbrhss-9itprfmaagup8">
+      <w:hyperlink w:history="1" r:id="rIdh1zgt-5sxicjmgv3-ur4y">
         <w:r>
           <w:rPr>
             <w:rFonts w:ascii="Times New Roman" w:cs="Times New Roman" w:eastAsia="Times New Roman" w:hAnsi="Times New Roman"/>
@@ -837,7 +837,7 @@
         </w:rPr>
         <w:t xml:space="preserve">, 2025. </w:t>
       </w:r>
-      <w:hyperlink w:history="1" r:id="rIdrrwsunzyigdl74920vqxg">
+      <w:hyperlink w:history="1" r:id="rId5wq97f5mg01mctybriyiq">
         <w:r>
           <w:rPr>
             <w:rFonts w:ascii="Times New Roman" w:cs="Times New Roman" w:eastAsia="Times New Roman" w:hAnsi="Times New Roman"/>
@@ -917,7 +917,7 @@
         </w:rPr>
         <w:t xml:space="preserve"> </w:t>
       </w:r>
-      <w:hyperlink w:history="1" r:id="rIdlwyg26s8h-x0h4yqxqxqi">
+      <w:hyperlink w:history="1" r:id="rIdq1mo6krphl9kjpdl67ojs">
         <w:r>
           <w:rPr>
             <w:rFonts w:ascii="Times New Roman" w:cs="Times New Roman" w:eastAsia="Times New Roman" w:hAnsi="Times New Roman"/>
@@ -981,7 +981,7 @@
         </w:rPr>
         <w:t xml:space="preserve">. </w:t>
       </w:r>
-      <w:hyperlink w:history="1" r:id="rIdhweu32izmjkmufwybs6et">
+      <w:hyperlink w:history="1" r:id="rIdda2hba70uclzw3thiezsr">
         <w:r>
           <w:rPr>
             <w:rFonts w:ascii="Times New Roman" w:cs="Times New Roman" w:eastAsia="Times New Roman" w:hAnsi="Times New Roman"/>
@@ -1268,7 +1268,7 @@
         </w:rPr>
         <w:t xml:space="preserve">Released public replication packages for both ISSTA 2026 papers on GitHub, archived on Zenodo (</w:t>
       </w:r>
-      <w:hyperlink w:history="1" r:id="rIdzih09-inu5tv7nock8ygl">
+      <w:hyperlink w:history="1" r:id="rIdjhof8hrbnjhb6orrkhjm1">
         <w:r>
           <w:rPr>
             <w:rFonts w:ascii="Times New Roman" w:cs="Times New Roman" w:eastAsia="Times New Roman" w:hAnsi="Times New Roman"/>
@@ -1287,7 +1287,7 @@
         </w:rPr>
         <w:t xml:space="preserve">, </w:t>
       </w:r>
-      <w:hyperlink w:history="1" r:id="rIdcvmnkftsmoq1ug4gzfcb5">
+      <w:hyperlink w:history="1" r:id="rIdsl-ywa_d3wcngokqdbya1">
         <w:r>
           <w:rPr>
             <w:rFonts w:ascii="Times New Roman" w:cs="Times New Roman" w:eastAsia="Times New Roman" w:hAnsi="Times New Roman"/>

</xml_diff>

<commit_message>
Add LinkedIn to sidebar, contact section, and CV
Co-Authored-By: Claude Opus 5.5 <noreply@anthropic.com>
</commit_message>
<xml_diff>
--- a/jundazhao_CV.docx
+++ b/jundazhao_CV.docx
@@ -50,7 +50,7 @@
         </w:rPr>
         <w:t xml:space="preserve">Toronto, ON, Canada  •  </w:t>
       </w:r>
-      <w:hyperlink w:history="1" r:id="rIdv5ztptguys9s3vldlwip-">
+      <w:hyperlink w:history="1" r:id="rIdoutndlvrjga5ednh7brut">
         <w:r>
           <w:rPr>
             <w:rFonts w:ascii="Times New Roman" w:cs="Times New Roman" w:eastAsia="Times New Roman" w:hAnsi="Times New Roman"/>
@@ -69,7 +69,7 @@
         </w:rPr>
         <w:t xml:space="preserve">  •  </w:t>
       </w:r>
-      <w:hyperlink w:history="1" r:id="rIdike9xodtvmgrcmrekjnwx">
+      <w:hyperlink w:history="1" r:id="rIdlsejevg-zg6hltp7jivjm">
         <w:r>
           <w:rPr>
             <w:rFonts w:ascii="Times New Roman" w:cs="Times New Roman" w:eastAsia="Times New Roman" w:hAnsi="Times New Roman"/>
@@ -86,7 +86,7 @@
         <w:spacing w:after="0"/>
         <w:jc w:val="center"/>
       </w:pPr>
-      <w:hyperlink w:history="1" r:id="rId0vhyhzby-vpwky-q6vfix">
+      <w:hyperlink w:history="1" r:id="rIdajfry9dhgsouu6v8jxr8n">
         <w:r>
           <w:rPr>
             <w:rFonts w:ascii="Times New Roman" w:cs="Times New Roman" w:eastAsia="Times New Roman" w:hAnsi="Times New Roman"/>
@@ -105,7 +105,7 @@
         </w:rPr>
         <w:t xml:space="preserve">  •  </w:t>
       </w:r>
-      <w:hyperlink w:history="1" r:id="rIdh6lxz0yaeprjuaohh7bis">
+      <w:hyperlink w:history="1" r:id="rId_p7liq7xshvxquzqqklda">
         <w:r>
           <w:rPr>
             <w:rFonts w:ascii="Times New Roman" w:cs="Times New Roman" w:eastAsia="Times New Roman" w:hAnsi="Times New Roman"/>
@@ -124,7 +124,7 @@
         </w:rPr>
         <w:t xml:space="preserve">  •  </w:t>
       </w:r>
-      <w:hyperlink w:history="1" r:id="rId5efxfuys9jysvkxrzvpn7">
+      <w:hyperlink w:history="1" r:id="rIdbee3fdxrvzbs3jx8jgv0y">
         <w:r>
           <w:rPr>
             <w:rFonts w:ascii="Times New Roman" w:cs="Times New Roman" w:eastAsia="Times New Roman" w:hAnsi="Times New Roman"/>
@@ -135,6 +135,25 @@
           <w:t xml:space="preserve">ORCID 0000-0003-4978-4128</w:t>
         </w:r>
       </w:hyperlink>
+      <w:r>
+        <w:rPr>
+          <w:rFonts w:ascii="Times New Roman" w:cs="Times New Roman" w:eastAsia="Times New Roman" w:hAnsi="Times New Roman"/>
+          <w:sz w:val="18"/>
+          <w:szCs w:val="18"/>
+        </w:rPr>
+        <w:t xml:space="preserve">  •  </w:t>
+      </w:r>
+      <w:hyperlink w:history="1" r:id="rId-fdeacxvttp7lqyn_9ff4">
+        <w:r>
+          <w:rPr>
+            <w:rFonts w:ascii="Times New Roman" w:cs="Times New Roman" w:eastAsia="Times New Roman" w:hAnsi="Times New Roman"/>
+            <w:color w:val="1A409A"/>
+            <w:sz w:val="18"/>
+            <w:szCs w:val="18"/>
+          </w:rPr>
+          <w:t xml:space="preserve">LinkedIn</w:t>
+        </w:r>
+      </w:hyperlink>
     </w:p>
     <w:p>
       <w:pPr>
@@ -709,7 +728,7 @@
         </w:rPr>
         <w:t xml:space="preserve"> </w:t>
       </w:r>
-      <w:hyperlink w:history="1" r:id="rIdqgnevqlipucvasz267sla">
+      <w:hyperlink w:history="1" r:id="rIdz24y7lyjf-tko49kkp_po">
         <w:r>
           <w:rPr>
             <w:rFonts w:ascii="Times New Roman" w:cs="Times New Roman" w:eastAsia="Times New Roman" w:hAnsi="Times New Roman"/>
@@ -773,7 +792,7 @@
         </w:rPr>
         <w:t xml:space="preserve">. </w:t>
       </w:r>
-      <w:hyperlink w:history="1" r:id="rIdh1zgt-5sxicjmgv3-ur4y">
+      <w:hyperlink w:history="1" r:id="rIdlef1oojiw-rcikun2tpcd">
         <w:r>
           <w:rPr>
             <w:rFonts w:ascii="Times New Roman" w:cs="Times New Roman" w:eastAsia="Times New Roman" w:hAnsi="Times New Roman"/>
@@ -837,7 +856,7 @@
         </w:rPr>
         <w:t xml:space="preserve">, 2025. </w:t>
       </w:r>
-      <w:hyperlink w:history="1" r:id="rId5wq97f5mg01mctybriyiq">
+      <w:hyperlink w:history="1" r:id="rIdbfrp8u_b2oe_s_yjj3v_r">
         <w:r>
           <w:rPr>
             <w:rFonts w:ascii="Times New Roman" w:cs="Times New Roman" w:eastAsia="Times New Roman" w:hAnsi="Times New Roman"/>
@@ -917,7 +936,7 @@
         </w:rPr>
         <w:t xml:space="preserve"> </w:t>
       </w:r>
-      <w:hyperlink w:history="1" r:id="rIdq1mo6krphl9kjpdl67ojs">
+      <w:hyperlink w:history="1" r:id="rId4prfotgxihvkvisemjegk">
         <w:r>
           <w:rPr>
             <w:rFonts w:ascii="Times New Roman" w:cs="Times New Roman" w:eastAsia="Times New Roman" w:hAnsi="Times New Roman"/>
@@ -981,7 +1000,7 @@
         </w:rPr>
         <w:t xml:space="preserve">. </w:t>
       </w:r>
-      <w:hyperlink w:history="1" r:id="rIdda2hba70uclzw3thiezsr">
+      <w:hyperlink w:history="1" r:id="rId8yq_pjvegwrczykae-90o">
         <w:r>
           <w:rPr>
             <w:rFonts w:ascii="Times New Roman" w:cs="Times New Roman" w:eastAsia="Times New Roman" w:hAnsi="Times New Roman"/>
@@ -1268,7 +1287,7 @@
         </w:rPr>
         <w:t xml:space="preserve">Released public replication packages for both ISSTA 2026 papers on GitHub, archived on Zenodo (</w:t>
       </w:r>
-      <w:hyperlink w:history="1" r:id="rIdjhof8hrbnjhb6orrkhjm1">
+      <w:hyperlink w:history="1" r:id="rId_91d6yeniqvgt8a5ugnvs">
         <w:r>
           <w:rPr>
             <w:rFonts w:ascii="Times New Roman" w:cs="Times New Roman" w:eastAsia="Times New Roman" w:hAnsi="Times New Roman"/>
@@ -1287,7 +1306,7 @@
         </w:rPr>
         <w:t xml:space="preserve">, </w:t>
       </w:r>
-      <w:hyperlink w:history="1" r:id="rIdsl-ywa_d3wcngokqdbya1">
+      <w:hyperlink w:history="1" r:id="rIdiq754ks-24xzeywvad1rk">
         <w:r>
           <w:rPr>
             <w:rFonts w:ascii="Times New Roman" w:cs="Times New Roman" w:eastAsia="Times New Roman" w:hAnsi="Times New Roman"/>

</xml_diff>

<commit_message>
Add Ontario Graduate Scholarship (2024 to 2025) to awards
Co-Authored-By: Claude Opus 5.5 <noreply@anthropic.com>
</commit_message>
<xml_diff>
--- a/jundazhao_CV.docx
+++ b/jundazhao_CV.docx
@@ -50,7 +50,7 @@
         </w:rPr>
         <w:t xml:space="preserve">Toronto, ON, Canada  •  </w:t>
       </w:r>
-      <w:hyperlink w:history="1" r:id="rIdoutndlvrjga5ednh7brut">
+      <w:hyperlink w:history="1" r:id="rIdhw_jxvhxvend9l_uraool">
         <w:r>
           <w:rPr>
             <w:rFonts w:ascii="Times New Roman" w:cs="Times New Roman" w:eastAsia="Times New Roman" w:hAnsi="Times New Roman"/>
@@ -69,7 +69,7 @@
         </w:rPr>
         <w:t xml:space="preserve">  •  </w:t>
       </w:r>
-      <w:hyperlink w:history="1" r:id="rIdlsejevg-zg6hltp7jivjm">
+      <w:hyperlink w:history="1" r:id="rIdg9xtmebr4hmy9emtvvisk">
         <w:r>
           <w:rPr>
             <w:rFonts w:ascii="Times New Roman" w:cs="Times New Roman" w:eastAsia="Times New Roman" w:hAnsi="Times New Roman"/>
@@ -86,7 +86,7 @@
         <w:spacing w:after="0"/>
         <w:jc w:val="center"/>
       </w:pPr>
-      <w:hyperlink w:history="1" r:id="rIdajfry9dhgsouu6v8jxr8n">
+      <w:hyperlink w:history="1" r:id="rIdlkyoyayrujisxtn46ubtz">
         <w:r>
           <w:rPr>
             <w:rFonts w:ascii="Times New Roman" w:cs="Times New Roman" w:eastAsia="Times New Roman" w:hAnsi="Times New Roman"/>
@@ -105,7 +105,7 @@
         </w:rPr>
         <w:t xml:space="preserve">  •  </w:t>
       </w:r>
-      <w:hyperlink w:history="1" r:id="rId_p7liq7xshvxquzqqklda">
+      <w:hyperlink w:history="1" r:id="rIdm00i60vfuq06kenzn_mbw">
         <w:r>
           <w:rPr>
             <w:rFonts w:ascii="Times New Roman" w:cs="Times New Roman" w:eastAsia="Times New Roman" w:hAnsi="Times New Roman"/>
@@ -124,7 +124,7 @@
         </w:rPr>
         <w:t xml:space="preserve">  •  </w:t>
       </w:r>
-      <w:hyperlink w:history="1" r:id="rIdbee3fdxrvzbs3jx8jgv0y">
+      <w:hyperlink w:history="1" r:id="rIdrimu6pn35t4u5zhrhc_wa">
         <w:r>
           <w:rPr>
             <w:rFonts w:ascii="Times New Roman" w:cs="Times New Roman" w:eastAsia="Times New Roman" w:hAnsi="Times New Roman"/>
@@ -143,7 +143,7 @@
         </w:rPr>
         <w:t xml:space="preserve">  •  </w:t>
       </w:r>
-      <w:hyperlink w:history="1" r:id="rId-fdeacxvttp7lqyn_9ff4">
+      <w:hyperlink w:history="1" r:id="rIdb0gaaokrihez7ntfcac6a">
         <w:r>
           <w:rPr>
             <w:rFonts w:ascii="Times New Roman" w:cs="Times New Roman" w:eastAsia="Times New Roman" w:hAnsi="Times New Roman"/>
@@ -644,6 +644,49 @@
     <w:p>
       <w:pPr>
         <w:keepNext/>
+        <w:tabs>
+          <w:tab w:val="right" w:pos="10800"/>
+        </w:tabs>
+        <w:spacing w:after="0" w:before="70"/>
+      </w:pPr>
+      <w:r>
+        <w:rPr>
+          <w:rFonts w:ascii="Times New Roman" w:cs="Times New Roman" w:eastAsia="Times New Roman" w:hAnsi="Times New Roman"/>
+          <w:b/>
+          <w:bCs/>
+          <w:sz w:val="20"/>
+          <w:szCs w:val="20"/>
+        </w:rPr>
+        <w:t xml:space="preserve">Ontario Graduate Scholarship (OGS)</w:t>
+      </w:r>
+      <w:r>
+        <w:rPr>
+          <w:rFonts w:ascii="Times New Roman" w:cs="Times New Roman" w:eastAsia="Times New Roman" w:hAnsi="Times New Roman"/>
+          <w:sz w:val="20"/>
+          <w:szCs w:val="20"/>
+        </w:rPr>
+        <w:t xml:space="preserve">, Government of Ontario and University of Toronto</w:t>
+      </w:r>
+      <w:r>
+        <w:rPr>
+          <w:rFonts w:ascii="Times New Roman" w:cs="Times New Roman" w:eastAsia="Times New Roman" w:hAnsi="Times New Roman"/>
+          <w:sz w:val="20"/>
+          <w:szCs w:val="20"/>
+        </w:rPr>
+        <w:t xml:space="preserve">	</w:t>
+      </w:r>
+      <w:r>
+        <w:rPr>
+          <w:rFonts w:ascii="Times New Roman" w:cs="Times New Roman" w:eastAsia="Times New Roman" w:hAnsi="Times New Roman"/>
+          <w:sz w:val="20"/>
+          <w:szCs w:val="20"/>
+        </w:rPr>
+        <w:t xml:space="preserve">2024 to 2025</w:t>
+      </w:r>
+    </w:p>
+    <w:p>
+      <w:pPr>
+        <w:keepNext/>
         <w:spacing w:after="30" w:before="150"/>
       </w:pPr>
       <w:r>
@@ -728,7 +771,7 @@
         </w:rPr>
         <w:t xml:space="preserve"> </w:t>
       </w:r>
-      <w:hyperlink w:history="1" r:id="rIdz24y7lyjf-tko49kkp_po">
+      <w:hyperlink w:history="1" r:id="rIdknoawb-iqyhichuezxfst">
         <w:r>
           <w:rPr>
             <w:rFonts w:ascii="Times New Roman" w:cs="Times New Roman" w:eastAsia="Times New Roman" w:hAnsi="Times New Roman"/>
@@ -792,7 +835,7 @@
         </w:rPr>
         <w:t xml:space="preserve">. </w:t>
       </w:r>
-      <w:hyperlink w:history="1" r:id="rIdlef1oojiw-rcikun2tpcd">
+      <w:hyperlink w:history="1" r:id="rIdokunirn1ttj8jmdesxelo">
         <w:r>
           <w:rPr>
             <w:rFonts w:ascii="Times New Roman" w:cs="Times New Roman" w:eastAsia="Times New Roman" w:hAnsi="Times New Roman"/>
@@ -856,7 +899,7 @@
         </w:rPr>
         <w:t xml:space="preserve">, 2025. </w:t>
       </w:r>
-      <w:hyperlink w:history="1" r:id="rIdbfrp8u_b2oe_s_yjj3v_r">
+      <w:hyperlink w:history="1" r:id="rIdxaroubo7lp31s_xf2y4-g">
         <w:r>
           <w:rPr>
             <w:rFonts w:ascii="Times New Roman" w:cs="Times New Roman" w:eastAsia="Times New Roman" w:hAnsi="Times New Roman"/>
@@ -936,7 +979,7 @@
         </w:rPr>
         <w:t xml:space="preserve"> </w:t>
       </w:r>
-      <w:hyperlink w:history="1" r:id="rId4prfotgxihvkvisemjegk">
+      <w:hyperlink w:history="1" r:id="rIdtd8e7fiopfpa_kgkkb-te">
         <w:r>
           <w:rPr>
             <w:rFonts w:ascii="Times New Roman" w:cs="Times New Roman" w:eastAsia="Times New Roman" w:hAnsi="Times New Roman"/>
@@ -1000,7 +1043,7 @@
         </w:rPr>
         <w:t xml:space="preserve">. </w:t>
       </w:r>
-      <w:hyperlink w:history="1" r:id="rId8yq_pjvegwrczykae-90o">
+      <w:hyperlink w:history="1" r:id="rIdxodf5howvl6jyv8m5ro7e">
         <w:r>
           <w:rPr>
             <w:rFonts w:ascii="Times New Roman" w:cs="Times New Roman" w:eastAsia="Times New Roman" w:hAnsi="Times New Roman"/>
@@ -1287,7 +1330,7 @@
         </w:rPr>
         <w:t xml:space="preserve">Released public replication packages for both ISSTA 2026 papers on GitHub, archived on Zenodo (</w:t>
       </w:r>
-      <w:hyperlink w:history="1" r:id="rId_91d6yeniqvgt8a5ugnvs">
+      <w:hyperlink w:history="1" r:id="rIdhbwagocbwl3ju9ob7i5na">
         <w:r>
           <w:rPr>
             <w:rFonts w:ascii="Times New Roman" w:cs="Times New Roman" w:eastAsia="Times New Roman" w:hAnsi="Times New Roman"/>
@@ -1306,7 +1349,7 @@
         </w:rPr>
         <w:t xml:space="preserve">, </w:t>
       </w:r>
-      <w:hyperlink w:history="1" r:id="rIdiq754ks-24xzeywvad1rk">
+      <w:hyperlink w:history="1" r:id="rId5ii-xuetk7mnsyecqrk0u">
         <w:r>
           <w:rPr>
             <w:rFonts w:ascii="Times New Roman" w:cs="Times New Roman" w:eastAsia="Times New Roman" w:hAnsi="Times New Roman"/>

</xml_diff>

<commit_message>
Describe PhD research experience at a general level
Co-Authored-By: Claude Opus 5.5 <noreply@anthropic.com>
</commit_message>
<xml_diff>
--- a/jundazhao_CV.docx
+++ b/jundazhao_CV.docx
@@ -50,7 +50,7 @@
         </w:rPr>
         <w:t xml:space="preserve">Toronto, ON, Canada  •  </w:t>
       </w:r>
-      <w:hyperlink w:history="1" r:id="rIdhw_jxvhxvend9l_uraool">
+      <w:hyperlink w:history="1" r:id="rIdsoezcbjb8fxe8s9zqgnyd">
         <w:r>
           <w:rPr>
             <w:rFonts w:ascii="Times New Roman" w:cs="Times New Roman" w:eastAsia="Times New Roman" w:hAnsi="Times New Roman"/>
@@ -69,7 +69,7 @@
         </w:rPr>
         <w:t xml:space="preserve">  •  </w:t>
       </w:r>
-      <w:hyperlink w:history="1" r:id="rIdg9xtmebr4hmy9emtvvisk">
+      <w:hyperlink w:history="1" r:id="rIdd9fszhbp7wsoz1pkz0o9z">
         <w:r>
           <w:rPr>
             <w:rFonts w:ascii="Times New Roman" w:cs="Times New Roman" w:eastAsia="Times New Roman" w:hAnsi="Times New Roman"/>
@@ -86,7 +86,7 @@
         <w:spacing w:after="0"/>
         <w:jc w:val="center"/>
       </w:pPr>
-      <w:hyperlink w:history="1" r:id="rIdlkyoyayrujisxtn46ubtz">
+      <w:hyperlink w:history="1" r:id="rId_lh9vzoymdd4oprtbnxex">
         <w:r>
           <w:rPr>
             <w:rFonts w:ascii="Times New Roman" w:cs="Times New Roman" w:eastAsia="Times New Roman" w:hAnsi="Times New Roman"/>
@@ -105,7 +105,7 @@
         </w:rPr>
         <w:t xml:space="preserve">  •  </w:t>
       </w:r>
-      <w:hyperlink w:history="1" r:id="rIdm00i60vfuq06kenzn_mbw">
+      <w:hyperlink w:history="1" r:id="rIdg1e6xp_ee0voxmidijmau">
         <w:r>
           <w:rPr>
             <w:rFonts w:ascii="Times New Roman" w:cs="Times New Roman" w:eastAsia="Times New Roman" w:hAnsi="Times New Roman"/>
@@ -124,7 +124,7 @@
         </w:rPr>
         <w:t xml:space="preserve">  •  </w:t>
       </w:r>
-      <w:hyperlink w:history="1" r:id="rIdrimu6pn35t4u5zhrhc_wa">
+      <w:hyperlink w:history="1" r:id="rIdtn8caxbaj00gu_2psdcr3">
         <w:r>
           <w:rPr>
             <w:rFonts w:ascii="Times New Roman" w:cs="Times New Roman" w:eastAsia="Times New Roman" w:hAnsi="Times New Roman"/>
@@ -143,7 +143,7 @@
         </w:rPr>
         <w:t xml:space="preserve">  •  </w:t>
       </w:r>
-      <w:hyperlink w:history="1" r:id="rIdb0gaaokrihez7ntfcac6a">
+      <w:hyperlink w:history="1" r:id="rIdme1vhpuu2s0ij5jufqvew">
         <w:r>
           <w:rPr>
             <w:rFonts w:ascii="Times New Roman" w:cs="Times New Roman" w:eastAsia="Times New Roman" w:hAnsi="Times New Roman"/>
@@ -771,7 +771,7 @@
         </w:rPr>
         <w:t xml:space="preserve"> </w:t>
       </w:r>
-      <w:hyperlink w:history="1" r:id="rIdknoawb-iqyhichuezxfst">
+      <w:hyperlink w:history="1" r:id="rIdvmjslo-ekxosb3oysqteh">
         <w:r>
           <w:rPr>
             <w:rFonts w:ascii="Times New Roman" w:cs="Times New Roman" w:eastAsia="Times New Roman" w:hAnsi="Times New Roman"/>
@@ -835,7 +835,7 @@
         </w:rPr>
         <w:t xml:space="preserve">. </w:t>
       </w:r>
-      <w:hyperlink w:history="1" r:id="rIdokunirn1ttj8jmdesxelo">
+      <w:hyperlink w:history="1" r:id="rIdqd77dkc8xt2sdwnnyw1vl">
         <w:r>
           <w:rPr>
             <w:rFonts w:ascii="Times New Roman" w:cs="Times New Roman" w:eastAsia="Times New Roman" w:hAnsi="Times New Roman"/>
@@ -899,7 +899,7 @@
         </w:rPr>
         <w:t xml:space="preserve">, 2025. </w:t>
       </w:r>
-      <w:hyperlink w:history="1" r:id="rIdxaroubo7lp31s_xf2y4-g">
+      <w:hyperlink w:history="1" r:id="rIdlrwivgwd4tr6lyrym82mg">
         <w:r>
           <w:rPr>
             <w:rFonts w:ascii="Times New Roman" w:cs="Times New Roman" w:eastAsia="Times New Roman" w:hAnsi="Times New Roman"/>
@@ -979,7 +979,7 @@
         </w:rPr>
         <w:t xml:space="preserve"> </w:t>
       </w:r>
-      <w:hyperlink w:history="1" r:id="rIdtd8e7fiopfpa_kgkkb-te">
+      <w:hyperlink w:history="1" r:id="rIdlttyimwwufbtgi9rsa9fj">
         <w:r>
           <w:rPr>
             <w:rFonts w:ascii="Times New Roman" w:cs="Times New Roman" w:eastAsia="Times New Roman" w:hAnsi="Times New Roman"/>
@@ -1043,7 +1043,7 @@
         </w:rPr>
         <w:t xml:space="preserve">. </w:t>
       </w:r>
-      <w:hyperlink w:history="1" r:id="rIdxodf5howvl6jyv8m5ro7e">
+      <w:hyperlink w:history="1" r:id="rIdxpciya8atj0axkiw6zrrd">
         <w:r>
           <w:rPr>
             <w:rFonts w:ascii="Times New Roman" w:cs="Times New Roman" w:eastAsia="Times New Roman" w:hAnsi="Times New Roman"/>
@@ -1203,20 +1203,10 @@
       <w:r>
         <w:rPr>
           <w:rFonts w:ascii="Times New Roman" w:cs="Times New Roman" w:eastAsia="Times New Roman" w:hAnsi="Times New Roman"/>
-          <w:b/>
-          <w:bCs/>
-          <w:sz w:val="20"/>
-          <w:szCs w:val="20"/>
-        </w:rPr>
-        <w:t xml:space="preserve">LLM-based unit test generation. </w:t>
-      </w:r>
-      <w:r>
-        <w:rPr>
-          <w:rFonts w:ascii="Times New Roman" w:cs="Times New Roman" w:eastAsia="Times New Roman" w:hAnsi="Times New Roman"/>
-          <w:sz w:val="20"/>
-          <w:szCs w:val="20"/>
-        </w:rPr>
-        <w:t xml:space="preserve">Introduced a metric for the misguidance effect, where buggy code steers LLMs toward tests that validate the bug rather than expose it. Evaluated 11 LLMs on 318 focal methods from Defects4J and proposed specification-based test generation, which reduces misguided tests while substantially increasing effective tests (ISSTA 2026).</w:t>
+          <w:sz w:val="20"/>
+          <w:szCs w:val="20"/>
+        </w:rPr>
+        <w:t xml:space="preserve">Reliable testing and verification for AI coding agents, with a focus on LLM-based unit test generation.</w:t>
       </w:r>
     </w:p>
     <w:p>
@@ -1231,20 +1221,10 @@
       <w:r>
         <w:rPr>
           <w:rFonts w:ascii="Times New Roman" w:cs="Times New Roman" w:eastAsia="Times New Roman" w:hAnsi="Times New Roman"/>
-          <w:b/>
-          <w:bCs/>
-          <w:sz w:val="20"/>
-          <w:szCs w:val="20"/>
-        </w:rPr>
-        <w:t xml:space="preserve">Evaluation of LLM-generated tests. </w:t>
-      </w:r>
-      <w:r>
-        <w:rPr>
-          <w:rFonts w:ascii="Times New Roman" w:cs="Times New Roman" w:eastAsia="Times New Roman" w:hAnsi="Times New Roman"/>
-          <w:sz w:val="20"/>
-          <w:szCs w:val="20"/>
-        </w:rPr>
-        <w:t xml:space="preserve">Led a large-scale replication of the Inozemtseva and Holmes and the Papadakis et al. studies on more than 100,000 test cases generated by 11 LLMs for Defects4J, showing that coverage and mutation scores are meaningful signals in regression-style settings but not reliable indicators when the code under test may already be buggy (ISSTA 2026, ACM SIGSOFT Distinguished Paper Award).</w:t>
+          <w:sz w:val="20"/>
+          <w:szCs w:val="20"/>
+        </w:rPr>
+        <w:t xml:space="preserve">Specification-based testing: recovering the intended behavior of code that may be buggy, and generating tests from it.</w:t>
       </w:r>
     </w:p>
     <w:p>
@@ -1259,20 +1239,10 @@
       <w:r>
         <w:rPr>
           <w:rFonts w:ascii="Times New Roman" w:cs="Times New Roman" w:eastAsia="Times New Roman" w:hAnsi="Times New Roman"/>
-          <w:b/>
-          <w:bCs/>
-          <w:sz w:val="20"/>
-          <w:szCs w:val="20"/>
-        </w:rPr>
-        <w:t xml:space="preserve">Specification recovery. </w:t>
-      </w:r>
-      <w:r>
-        <w:rPr>
-          <w:rFonts w:ascii="Times New Roman" w:cs="Times New Roman" w:eastAsia="Times New Roman" w:hAnsi="Times New Roman"/>
-          <w:sz w:val="20"/>
-          <w:szCs w:val="20"/>
-        </w:rPr>
-        <w:t xml:space="preserve">Dissertation research on accurate, evidence-driven, and uncertainty-aware recovery of behavioral specifications from imperfect code, so that generated tests detect bugs.</w:t>
+          <w:sz w:val="20"/>
+          <w:szCs w:val="20"/>
+        </w:rPr>
+        <w:t xml:space="preserve">Evaluation of LLM-generated tests and of the metrics used to judge them.</w:t>
       </w:r>
     </w:p>
     <w:p>
@@ -1287,20 +1257,10 @@
       <w:r>
         <w:rPr>
           <w:rFonts w:ascii="Times New Roman" w:cs="Times New Roman" w:eastAsia="Times New Roman" w:hAnsi="Times New Roman"/>
-          <w:b/>
-          <w:bCs/>
-          <w:sz w:val="20"/>
-          <w:szCs w:val="20"/>
-        </w:rPr>
-        <w:t xml:space="preserve">Code summarization. </w:t>
-      </w:r>
-      <w:r>
-        <w:rPr>
-          <w:rFonts w:ascii="Times New Roman" w:cs="Times New Roman" w:eastAsia="Times New Roman" w:hAnsi="Times New Roman"/>
-          <w:sz w:val="20"/>
-          <w:szCs w:val="20"/>
-        </w:rPr>
-        <w:t xml:space="preserve">Developed Variational Prefix Tuning, a parameter-efficient method that integrates a conditional variational autoencoder into pre-trained language models of code to generate diverse yet accurate summaries (JSS 2025).</w:t>
+          <w:sz w:val="20"/>
+          <w:szCs w:val="20"/>
+        </w:rPr>
+        <w:t xml:space="preserve">Code summarization with pre-trained language models of code.</w:t>
       </w:r>
     </w:p>
     <w:p>
@@ -1315,58 +1275,10 @@
       <w:r>
         <w:rPr>
           <w:rFonts w:ascii="Times New Roman" w:cs="Times New Roman" w:eastAsia="Times New Roman" w:hAnsi="Times New Roman"/>
-          <w:b/>
-          <w:bCs/>
-          <w:sz w:val="20"/>
-          <w:szCs w:val="20"/>
-        </w:rPr>
-        <w:t xml:space="preserve">Open research artifacts. </w:t>
-      </w:r>
-      <w:r>
-        <w:rPr>
-          <w:rFonts w:ascii="Times New Roman" w:cs="Times New Roman" w:eastAsia="Times New Roman" w:hAnsi="Times New Roman"/>
-          <w:sz w:val="20"/>
-          <w:szCs w:val="20"/>
-        </w:rPr>
-        <w:t xml:space="preserve">Released public replication packages for both ISSTA 2026 papers on GitHub, archived on Zenodo (</w:t>
-      </w:r>
-      <w:hyperlink w:history="1" r:id="rIdhbwagocbwl3ju9ob7i5na">
-        <w:r>
-          <w:rPr>
-            <w:rFonts w:ascii="Times New Roman" w:cs="Times New Roman" w:eastAsia="Times New Roman" w:hAnsi="Times New Roman"/>
-            <w:color w:val="1A409A"/>
-            <w:sz w:val="20"/>
-            <w:szCs w:val="20"/>
-          </w:rPr>
-          <w:t xml:space="preserve">10.5281/zenodo.21429528</w:t>
-        </w:r>
-      </w:hyperlink>
-      <w:r>
-        <w:rPr>
-          <w:rFonts w:ascii="Times New Roman" w:cs="Times New Roman" w:eastAsia="Times New Roman" w:hAnsi="Times New Roman"/>
-          <w:sz w:val="20"/>
-          <w:szCs w:val="20"/>
-        </w:rPr>
-        <w:t xml:space="preserve">, </w:t>
-      </w:r>
-      <w:hyperlink w:history="1" r:id="rId5ii-xuetk7mnsyecqrk0u">
-        <w:r>
-          <w:rPr>
-            <w:rFonts w:ascii="Times New Roman" w:cs="Times New Roman" w:eastAsia="Times New Roman" w:hAnsi="Times New Roman"/>
-            <w:color w:val="1A409A"/>
-            <w:sz w:val="20"/>
-            <w:szCs w:val="20"/>
-          </w:rPr>
-          <w:t xml:space="preserve">10.5281/zenodo.21428153</w:t>
-        </w:r>
-      </w:hyperlink>
-      <w:r>
-        <w:rPr>
-          <w:rFonts w:ascii="Times New Roman" w:cs="Times New Roman" w:eastAsia="Times New Roman" w:hAnsi="Times New Roman"/>
-          <w:sz w:val="20"/>
-          <w:szCs w:val="20"/>
-        </w:rPr>
-        <w:t xml:space="preserve">).</w:t>
+          <w:sz w:val="20"/>
+          <w:szCs w:val="20"/>
+        </w:rPr>
+        <w:t xml:space="preserve">Public replication packages for published work.</w:t>
       </w:r>
     </w:p>
     <w:p>

</xml_diff>

<commit_message>
Remove Skills section from CV
Co-Authored-By: Claude Opus 5.5 <noreply@anthropic.com>
</commit_message>
<xml_diff>
--- a/jundazhao_CV.docx
+++ b/jundazhao_CV.docx
@@ -50,7 +50,7 @@
         </w:rPr>
         <w:t xml:space="preserve">Toronto, ON, Canada  •  </w:t>
       </w:r>
-      <w:hyperlink w:history="1" r:id="rIdsoezcbjb8fxe8s9zqgnyd">
+      <w:hyperlink w:history="1" r:id="rIda2ayvvgven0l5ziq1lsx-">
         <w:r>
           <w:rPr>
             <w:rFonts w:ascii="Times New Roman" w:cs="Times New Roman" w:eastAsia="Times New Roman" w:hAnsi="Times New Roman"/>
@@ -69,7 +69,7 @@
         </w:rPr>
         <w:t xml:space="preserve">  •  </w:t>
       </w:r>
-      <w:hyperlink w:history="1" r:id="rIdd9fszhbp7wsoz1pkz0o9z">
+      <w:hyperlink w:history="1" r:id="rId5hu26dfozsqtwfrivdohb">
         <w:r>
           <w:rPr>
             <w:rFonts w:ascii="Times New Roman" w:cs="Times New Roman" w:eastAsia="Times New Roman" w:hAnsi="Times New Roman"/>
@@ -86,7 +86,7 @@
         <w:spacing w:after="0"/>
         <w:jc w:val="center"/>
       </w:pPr>
-      <w:hyperlink w:history="1" r:id="rId_lh9vzoymdd4oprtbnxex">
+      <w:hyperlink w:history="1" r:id="rId4mr1aozeh2n_dhr4kwnie">
         <w:r>
           <w:rPr>
             <w:rFonts w:ascii="Times New Roman" w:cs="Times New Roman" w:eastAsia="Times New Roman" w:hAnsi="Times New Roman"/>
@@ -105,7 +105,7 @@
         </w:rPr>
         <w:t xml:space="preserve">  •  </w:t>
       </w:r>
-      <w:hyperlink w:history="1" r:id="rIdg1e6xp_ee0voxmidijmau">
+      <w:hyperlink w:history="1" r:id="rIdcouzbeuc1bu0dccumbqmv">
         <w:r>
           <w:rPr>
             <w:rFonts w:ascii="Times New Roman" w:cs="Times New Roman" w:eastAsia="Times New Roman" w:hAnsi="Times New Roman"/>
@@ -124,7 +124,7 @@
         </w:rPr>
         <w:t xml:space="preserve">  •  </w:t>
       </w:r>
-      <w:hyperlink w:history="1" r:id="rIdtn8caxbaj00gu_2psdcr3">
+      <w:hyperlink w:history="1" r:id="rIdirxqgpuk64gjk0tbdfdtw">
         <w:r>
           <w:rPr>
             <w:rFonts w:ascii="Times New Roman" w:cs="Times New Roman" w:eastAsia="Times New Roman" w:hAnsi="Times New Roman"/>
@@ -143,7 +143,7 @@
         </w:rPr>
         <w:t xml:space="preserve">  •  </w:t>
       </w:r>
-      <w:hyperlink w:history="1" r:id="rIdme1vhpuu2s0ij5jufqvew">
+      <w:hyperlink w:history="1" r:id="rIdpscxjxc8oqnm-javg75bl">
         <w:r>
           <w:rPr>
             <w:rFonts w:ascii="Times New Roman" w:cs="Times New Roman" w:eastAsia="Times New Roman" w:hAnsi="Times New Roman"/>
@@ -771,7 +771,7 @@
         </w:rPr>
         <w:t xml:space="preserve"> </w:t>
       </w:r>
-      <w:hyperlink w:history="1" r:id="rIdvmjslo-ekxosb3oysqteh">
+      <w:hyperlink w:history="1" r:id="rId31h544ybzlp3ypvhu_smm">
         <w:r>
           <w:rPr>
             <w:rFonts w:ascii="Times New Roman" w:cs="Times New Roman" w:eastAsia="Times New Roman" w:hAnsi="Times New Roman"/>
@@ -835,7 +835,7 @@
         </w:rPr>
         <w:t xml:space="preserve">. </w:t>
       </w:r>
-      <w:hyperlink w:history="1" r:id="rIdqd77dkc8xt2sdwnnyw1vl">
+      <w:hyperlink w:history="1" r:id="rIdaeziebzn1vtwqrzm48ben">
         <w:r>
           <w:rPr>
             <w:rFonts w:ascii="Times New Roman" w:cs="Times New Roman" w:eastAsia="Times New Roman" w:hAnsi="Times New Roman"/>
@@ -899,7 +899,7 @@
         </w:rPr>
         <w:t xml:space="preserve">, 2025. </w:t>
       </w:r>
-      <w:hyperlink w:history="1" r:id="rIdlrwivgwd4tr6lyrym82mg">
+      <w:hyperlink w:history="1" r:id="rIdpvsjqboqtt04vfqlujd1_">
         <w:r>
           <w:rPr>
             <w:rFonts w:ascii="Times New Roman" w:cs="Times New Roman" w:eastAsia="Times New Roman" w:hAnsi="Times New Roman"/>
@@ -979,7 +979,7 @@
         </w:rPr>
         <w:t xml:space="preserve"> </w:t>
       </w:r>
-      <w:hyperlink w:history="1" r:id="rIdlttyimwwufbtgi9rsa9fj">
+      <w:hyperlink w:history="1" r:id="rIdnav1fui3jqimeg720tefr">
         <w:r>
           <w:rPr>
             <w:rFonts w:ascii="Times New Roman" w:cs="Times New Roman" w:eastAsia="Times New Roman" w:hAnsi="Times New Roman"/>
@@ -1043,7 +1043,7 @@
         </w:rPr>
         <w:t xml:space="preserve">. </w:t>
       </w:r>
-      <w:hyperlink w:history="1" r:id="rIdxpciya8atj0axkiw6zrrd">
+      <w:hyperlink w:history="1" r:id="rIdslzhmefwwwro2lgx-qelb">
         <w:r>
           <w:rPr>
             <w:rFonts w:ascii="Times New Roman" w:cs="Times New Roman" w:eastAsia="Times New Roman" w:hAnsi="Times New Roman"/>
@@ -2065,135 +2065,6 @@
           <w:szCs w:val="20"/>
         </w:rPr>
         <w:t xml:space="preserve">Built and maintained a database system for tracking and analyzing network access and activity information for students, faculty, and staff on the university network.</w:t>
-      </w:r>
-    </w:p>
-    <w:p>
-      <w:pPr>
-        <w:keepNext/>
-        <w:spacing w:after="30" w:before="150"/>
-      </w:pPr>
-      <w:r>
-        <w:rPr>
-          <w:rFonts w:ascii="Times New Roman" w:cs="Times New Roman" w:eastAsia="Times New Roman" w:hAnsi="Times New Roman"/>
-          <w:b/>
-          <w:bCs/>
-          <w:color w:val="1A409A"/>
-          <w:sz w:val="30"/>
-          <w:szCs w:val="30"/>
-        </w:rPr>
-        <w:t xml:space="preserve">Skills</w:t>
-      </w:r>
-    </w:p>
-    <w:p>
-      <w:pPr>
-        <w:pStyle w:val="ListParagraph"/>
-        <w:numPr>
-          <w:ilvl w:val="0"/>
-          <w:numId w:val="2"/>
-        </w:numPr>
-        <w:spacing w:after="0" w:before="0"/>
-      </w:pPr>
-      <w:r>
-        <w:rPr>
-          <w:rFonts w:ascii="Times New Roman" w:cs="Times New Roman" w:eastAsia="Times New Roman" w:hAnsi="Times New Roman"/>
-          <w:b/>
-          <w:bCs/>
-          <w:sz w:val="20"/>
-          <w:szCs w:val="20"/>
-        </w:rPr>
-        <w:t xml:space="preserve">Programming: </w:t>
-      </w:r>
-      <w:r>
-        <w:rPr>
-          <w:rFonts w:ascii="Times New Roman" w:cs="Times New Roman" w:eastAsia="Times New Roman" w:hAnsi="Times New Roman"/>
-          <w:sz w:val="20"/>
-          <w:szCs w:val="20"/>
-        </w:rPr>
-        <w:t xml:space="preserve">Python, C++ (Eigen, libigl), MATLAB; Java for test generation and evaluation (JUnit, Defects4J)</w:t>
-      </w:r>
-    </w:p>
-    <w:p>
-      <w:pPr>
-        <w:pStyle w:val="ListParagraph"/>
-        <w:numPr>
-          <w:ilvl w:val="0"/>
-          <w:numId w:val="2"/>
-        </w:numPr>
-        <w:spacing w:after="0" w:before="0"/>
-      </w:pPr>
-      <w:r>
-        <w:rPr>
-          <w:rFonts w:ascii="Times New Roman" w:cs="Times New Roman" w:eastAsia="Times New Roman" w:hAnsi="Times New Roman"/>
-          <w:b/>
-          <w:bCs/>
-          <w:sz w:val="20"/>
-          <w:szCs w:val="20"/>
-        </w:rPr>
-        <w:t xml:space="preserve">Machine learning: </w:t>
-      </w:r>
-      <w:r>
-        <w:rPr>
-          <w:rFonts w:ascii="Times New Roman" w:cs="Times New Roman" w:eastAsia="Times New Roman" w:hAnsi="Times New Roman"/>
-          <w:sz w:val="20"/>
-          <w:szCs w:val="20"/>
-        </w:rPr>
-        <w:t xml:space="preserve">PyTorch, NumPy, OpenCV; large language models and deep generative models; statistical analysis and modeling</w:t>
-      </w:r>
-    </w:p>
-    <w:p>
-      <w:pPr>
-        <w:pStyle w:val="ListParagraph"/>
-        <w:numPr>
-          <w:ilvl w:val="0"/>
-          <w:numId w:val="2"/>
-        </w:numPr>
-        <w:spacing w:after="0" w:before="0"/>
-      </w:pPr>
-      <w:r>
-        <w:rPr>
-          <w:rFonts w:ascii="Times New Roman" w:cs="Times New Roman" w:eastAsia="Times New Roman" w:hAnsi="Times New Roman"/>
-          <w:b/>
-          <w:bCs/>
-          <w:sz w:val="20"/>
-          <w:szCs w:val="20"/>
-        </w:rPr>
-        <w:t xml:space="preserve">Software testing and analysis: </w:t>
-      </w:r>
-      <w:r>
-        <w:rPr>
-          <w:rFonts w:ascii="Times New Roman" w:cs="Times New Roman" w:eastAsia="Times New Roman" w:hAnsi="Times New Roman"/>
-          <w:sz w:val="20"/>
-          <w:szCs w:val="20"/>
-        </w:rPr>
-        <w:t xml:space="preserve">LLM-based test generation, coverage and mutation analysis (JaCoCo, PIT, CodeCover), experiment design</w:t>
-      </w:r>
-    </w:p>
-    <w:p>
-      <w:pPr>
-        <w:pStyle w:val="ListParagraph"/>
-        <w:numPr>
-          <w:ilvl w:val="0"/>
-          <w:numId w:val="2"/>
-        </w:numPr>
-        <w:spacing w:after="0" w:before="0"/>
-      </w:pPr>
-      <w:r>
-        <w:rPr>
-          <w:rFonts w:ascii="Times New Roman" w:cs="Times New Roman" w:eastAsia="Times New Roman" w:hAnsi="Times New Roman"/>
-          <w:b/>
-          <w:bCs/>
-          <w:sz w:val="20"/>
-          <w:szCs w:val="20"/>
-        </w:rPr>
-        <w:t xml:space="preserve">Languages: </w:t>
-      </w:r>
-      <w:r>
-        <w:rPr>
-          <w:rFonts w:ascii="Times New Roman" w:cs="Times New Roman" w:eastAsia="Times New Roman" w:hAnsi="Times New Roman"/>
-          <w:sz w:val="20"/>
-          <w:szCs w:val="20"/>
-        </w:rPr>
-        <w:t xml:space="preserve">fluent in English and Mandarin</w:t>
       </w:r>
     </w:p>
     <w:sectPr>

</xml_diff>

<commit_message>
CV: replace replication-package line with human-AI collaboration focus
Co-Authored-By: Claude Opus 5.5 <noreply@anthropic.com>
</commit_message>
<xml_diff>
--- a/jundazhao_CV.docx
+++ b/jundazhao_CV.docx
@@ -50,7 +50,7 @@
         </w:rPr>
         <w:t xml:space="preserve">Toronto, ON, Canada  •  </w:t>
       </w:r>
-      <w:hyperlink w:history="1" r:id="rIda2ayvvgven0l5ziq1lsx-">
+      <w:hyperlink w:history="1" r:id="rIdcwm05jvl_ywx2c15_9spr">
         <w:r>
           <w:rPr>
             <w:rFonts w:ascii="Times New Roman" w:cs="Times New Roman" w:eastAsia="Times New Roman" w:hAnsi="Times New Roman"/>
@@ -69,7 +69,7 @@
         </w:rPr>
         <w:t xml:space="preserve">  •  </w:t>
       </w:r>
-      <w:hyperlink w:history="1" r:id="rId5hu26dfozsqtwfrivdohb">
+      <w:hyperlink w:history="1" r:id="rIdyue8umtkmdsw5bx3rc6yv">
         <w:r>
           <w:rPr>
             <w:rFonts w:ascii="Times New Roman" w:cs="Times New Roman" w:eastAsia="Times New Roman" w:hAnsi="Times New Roman"/>
@@ -86,7 +86,7 @@
         <w:spacing w:after="0"/>
         <w:jc w:val="center"/>
       </w:pPr>
-      <w:hyperlink w:history="1" r:id="rId4mr1aozeh2n_dhr4kwnie">
+      <w:hyperlink w:history="1" r:id="rIdnsi-uvst_lnjdpegzlvtr">
         <w:r>
           <w:rPr>
             <w:rFonts w:ascii="Times New Roman" w:cs="Times New Roman" w:eastAsia="Times New Roman" w:hAnsi="Times New Roman"/>
@@ -105,7 +105,7 @@
         </w:rPr>
         <w:t xml:space="preserve">  •  </w:t>
       </w:r>
-      <w:hyperlink w:history="1" r:id="rIdcouzbeuc1bu0dccumbqmv">
+      <w:hyperlink w:history="1" r:id="rId_0ia6gaij8vjkwz5gpeal">
         <w:r>
           <w:rPr>
             <w:rFonts w:ascii="Times New Roman" w:cs="Times New Roman" w:eastAsia="Times New Roman" w:hAnsi="Times New Roman"/>
@@ -124,7 +124,7 @@
         </w:rPr>
         <w:t xml:space="preserve">  •  </w:t>
       </w:r>
-      <w:hyperlink w:history="1" r:id="rIdirxqgpuk64gjk0tbdfdtw">
+      <w:hyperlink w:history="1" r:id="rIdi-wxr9rh9eh3dq6h7ex-w">
         <w:r>
           <w:rPr>
             <w:rFonts w:ascii="Times New Roman" w:cs="Times New Roman" w:eastAsia="Times New Roman" w:hAnsi="Times New Roman"/>
@@ -143,7 +143,7 @@
         </w:rPr>
         <w:t xml:space="preserve">  •  </w:t>
       </w:r>
-      <w:hyperlink w:history="1" r:id="rIdpscxjxc8oqnm-javg75bl">
+      <w:hyperlink w:history="1" r:id="rIdny5t1ik2tpzjwzduogpkb">
         <w:r>
           <w:rPr>
             <w:rFonts w:ascii="Times New Roman" w:cs="Times New Roman" w:eastAsia="Times New Roman" w:hAnsi="Times New Roman"/>
@@ -771,7 +771,7 @@
         </w:rPr>
         <w:t xml:space="preserve"> </w:t>
       </w:r>
-      <w:hyperlink w:history="1" r:id="rId31h544ybzlp3ypvhu_smm">
+      <w:hyperlink w:history="1" r:id="rIdyduqre9o-q_-8lhosbvrr">
         <w:r>
           <w:rPr>
             <w:rFonts w:ascii="Times New Roman" w:cs="Times New Roman" w:eastAsia="Times New Roman" w:hAnsi="Times New Roman"/>
@@ -835,7 +835,7 @@
         </w:rPr>
         <w:t xml:space="preserve">. </w:t>
       </w:r>
-      <w:hyperlink w:history="1" r:id="rIdaeziebzn1vtwqrzm48ben">
+      <w:hyperlink w:history="1" r:id="rIdu5u98bicgzzhsllakthfb">
         <w:r>
           <w:rPr>
             <w:rFonts w:ascii="Times New Roman" w:cs="Times New Roman" w:eastAsia="Times New Roman" w:hAnsi="Times New Roman"/>
@@ -899,7 +899,7 @@
         </w:rPr>
         <w:t xml:space="preserve">, 2025. </w:t>
       </w:r>
-      <w:hyperlink w:history="1" r:id="rIdpvsjqboqtt04vfqlujd1_">
+      <w:hyperlink w:history="1" r:id="rIdyyntto5gaemyf-46re7v4">
         <w:r>
           <w:rPr>
             <w:rFonts w:ascii="Times New Roman" w:cs="Times New Roman" w:eastAsia="Times New Roman" w:hAnsi="Times New Roman"/>
@@ -979,7 +979,7 @@
         </w:rPr>
         <w:t xml:space="preserve"> </w:t>
       </w:r>
-      <w:hyperlink w:history="1" r:id="rIdnav1fui3jqimeg720tefr">
+      <w:hyperlink w:history="1" r:id="rId8fovnath-epvuutok1wne">
         <w:r>
           <w:rPr>
             <w:rFonts w:ascii="Times New Roman" w:cs="Times New Roman" w:eastAsia="Times New Roman" w:hAnsi="Times New Roman"/>
@@ -1043,7 +1043,7 @@
         </w:rPr>
         <w:t xml:space="preserve">. </w:t>
       </w:r>
-      <w:hyperlink w:history="1" r:id="rIdslzhmefwwwro2lgx-qelb">
+      <w:hyperlink w:history="1" r:id="rIdhijokrmvl6eclmeztnrdk">
         <w:r>
           <w:rPr>
             <w:rFonts w:ascii="Times New Roman" w:cs="Times New Roman" w:eastAsia="Times New Roman" w:hAnsi="Times New Roman"/>
@@ -1278,7 +1278,7 @@
           <w:sz w:val="20"/>
           <w:szCs w:val="20"/>
         </w:rPr>
-        <w:t xml:space="preserve">Public replication packages for published work.</w:t>
+        <w:t xml:space="preserve">Improving the reliability of testing and verification when people work with AI-assisted development tools.</w:t>
       </w:r>
     </w:p>
     <w:p>

</xml_diff>

<commit_message>
CV: list current research lines before earlier work
Co-Authored-By: Claude Opus 5.5 <noreply@anthropic.com>
</commit_message>
<xml_diff>
--- a/jundazhao_CV.docx
+++ b/jundazhao_CV.docx
@@ -50,7 +50,7 @@
         </w:rPr>
         <w:t xml:space="preserve">Toronto, ON, Canada  •  </w:t>
       </w:r>
-      <w:hyperlink w:history="1" r:id="rIdcwm05jvl_ywx2c15_9spr">
+      <w:hyperlink w:history="1" r:id="rIdlrbh-cqovmvbkizbshqkv">
         <w:r>
           <w:rPr>
             <w:rFonts w:ascii="Times New Roman" w:cs="Times New Roman" w:eastAsia="Times New Roman" w:hAnsi="Times New Roman"/>
@@ -69,7 +69,7 @@
         </w:rPr>
         <w:t xml:space="preserve">  •  </w:t>
       </w:r>
-      <w:hyperlink w:history="1" r:id="rIdyue8umtkmdsw5bx3rc6yv">
+      <w:hyperlink w:history="1" r:id="rIdq-dx3ckor0drq-cc8pueh">
         <w:r>
           <w:rPr>
             <w:rFonts w:ascii="Times New Roman" w:cs="Times New Roman" w:eastAsia="Times New Roman" w:hAnsi="Times New Roman"/>
@@ -86,7 +86,7 @@
         <w:spacing w:after="0"/>
         <w:jc w:val="center"/>
       </w:pPr>
-      <w:hyperlink w:history="1" r:id="rIdnsi-uvst_lnjdpegzlvtr">
+      <w:hyperlink w:history="1" r:id="rId3m4dzk59imnlnd22zmuxo">
         <w:r>
           <w:rPr>
             <w:rFonts w:ascii="Times New Roman" w:cs="Times New Roman" w:eastAsia="Times New Roman" w:hAnsi="Times New Roman"/>
@@ -105,7 +105,7 @@
         </w:rPr>
         <w:t xml:space="preserve">  •  </w:t>
       </w:r>
-      <w:hyperlink w:history="1" r:id="rId_0ia6gaij8vjkwz5gpeal">
+      <w:hyperlink w:history="1" r:id="rIdtbsfclu9ftrxlr5gxiz2y">
         <w:r>
           <w:rPr>
             <w:rFonts w:ascii="Times New Roman" w:cs="Times New Roman" w:eastAsia="Times New Roman" w:hAnsi="Times New Roman"/>
@@ -124,7 +124,7 @@
         </w:rPr>
         <w:t xml:space="preserve">  •  </w:t>
       </w:r>
-      <w:hyperlink w:history="1" r:id="rIdi-wxr9rh9eh3dq6h7ex-w">
+      <w:hyperlink w:history="1" r:id="rId8xe_mleyeylr88b-fetwe">
         <w:r>
           <w:rPr>
             <w:rFonts w:ascii="Times New Roman" w:cs="Times New Roman" w:eastAsia="Times New Roman" w:hAnsi="Times New Roman"/>
@@ -143,7 +143,7 @@
         </w:rPr>
         <w:t xml:space="preserve">  •  </w:t>
       </w:r>
-      <w:hyperlink w:history="1" r:id="rIdny5t1ik2tpzjwzduogpkb">
+      <w:hyperlink w:history="1" r:id="rIdrdeii-ghqoeypkq18kzur">
         <w:r>
           <w:rPr>
             <w:rFonts w:ascii="Times New Roman" w:cs="Times New Roman" w:eastAsia="Times New Roman" w:hAnsi="Times New Roman"/>
@@ -771,7 +771,7 @@
         </w:rPr>
         <w:t xml:space="preserve"> </w:t>
       </w:r>
-      <w:hyperlink w:history="1" r:id="rIdyduqre9o-q_-8lhosbvrr">
+      <w:hyperlink w:history="1" r:id="rIdla2vvzl2f7un68x3jk5mq">
         <w:r>
           <w:rPr>
             <w:rFonts w:ascii="Times New Roman" w:cs="Times New Roman" w:eastAsia="Times New Roman" w:hAnsi="Times New Roman"/>
@@ -835,7 +835,7 @@
         </w:rPr>
         <w:t xml:space="preserve">. </w:t>
       </w:r>
-      <w:hyperlink w:history="1" r:id="rIdu5u98bicgzzhsllakthfb">
+      <w:hyperlink w:history="1" r:id="rId_ykerfoodhykx0tdqnaqj">
         <w:r>
           <w:rPr>
             <w:rFonts w:ascii="Times New Roman" w:cs="Times New Roman" w:eastAsia="Times New Roman" w:hAnsi="Times New Roman"/>
@@ -899,7 +899,7 @@
         </w:rPr>
         <w:t xml:space="preserve">, 2025. </w:t>
       </w:r>
-      <w:hyperlink w:history="1" r:id="rIdyyntto5gaemyf-46re7v4">
+      <w:hyperlink w:history="1" r:id="rIdxlvudaq-1kci6vnbpr6lr">
         <w:r>
           <w:rPr>
             <w:rFonts w:ascii="Times New Roman" w:cs="Times New Roman" w:eastAsia="Times New Roman" w:hAnsi="Times New Roman"/>
@@ -979,7 +979,7 @@
         </w:rPr>
         <w:t xml:space="preserve"> </w:t>
       </w:r>
-      <w:hyperlink w:history="1" r:id="rId8fovnath-epvuutok1wne">
+      <w:hyperlink w:history="1" r:id="rIdet4sqeblskhcqvqapbrge">
         <w:r>
           <w:rPr>
             <w:rFonts w:ascii="Times New Roman" w:cs="Times New Roman" w:eastAsia="Times New Roman" w:hAnsi="Times New Roman"/>
@@ -1043,7 +1043,7 @@
         </w:rPr>
         <w:t xml:space="preserve">. </w:t>
       </w:r>
-      <w:hyperlink w:history="1" r:id="rIdhijokrmvl6eclmeztnrdk">
+      <w:hyperlink w:history="1" r:id="rIdvnnpvlfuiu0p8awan91gv">
         <w:r>
           <w:rPr>
             <w:rFonts w:ascii="Times New Roman" w:cs="Times New Roman" w:eastAsia="Times New Roman" w:hAnsi="Times New Roman"/>
@@ -1260,7 +1260,7 @@
           <w:sz w:val="20"/>
           <w:szCs w:val="20"/>
         </w:rPr>
-        <w:t xml:space="preserve">Code summarization with pre-trained language models of code.</w:t>
+        <w:t xml:space="preserve">Improving the reliability of testing and verification when people work with AI-assisted development tools.</w:t>
       </w:r>
     </w:p>
     <w:p>
@@ -1278,7 +1278,7 @@
           <w:sz w:val="20"/>
           <w:szCs w:val="20"/>
         </w:rPr>
-        <w:t xml:space="preserve">Improving the reliability of testing and verification when people work with AI-assisted development tools.</w:t>
+        <w:t xml:space="preserve">Code summarization with pre-trained language models of code.</w:t>
       </w:r>
     </w:p>
     <w:p>

</xml_diff>

<commit_message>
Drop "in production" from research description
Co-Authored-By: Claude Opus 5.5 <noreply@anthropic.com>
</commit_message>
<xml_diff>
--- a/jundazhao_CV.docx
+++ b/jundazhao_CV.docx
@@ -50,7 +50,7 @@
         </w:rPr>
         <w:t xml:space="preserve">Toronto, ON, Canada  •  </w:t>
       </w:r>
-      <w:hyperlink w:history="1" r:id="rIdlrbh-cqovmvbkizbshqkv">
+      <w:hyperlink w:history="1" r:id="rIdxpo34kbsylt2inyqvpdcg">
         <w:r>
           <w:rPr>
             <w:rFonts w:ascii="Times New Roman" w:cs="Times New Roman" w:eastAsia="Times New Roman" w:hAnsi="Times New Roman"/>
@@ -69,7 +69,7 @@
         </w:rPr>
         <w:t xml:space="preserve">  •  </w:t>
       </w:r>
-      <w:hyperlink w:history="1" r:id="rIdq-dx3ckor0drq-cc8pueh">
+      <w:hyperlink w:history="1" r:id="rIdzi678by5k84dz5fhgawpz">
         <w:r>
           <w:rPr>
             <w:rFonts w:ascii="Times New Roman" w:cs="Times New Roman" w:eastAsia="Times New Roman" w:hAnsi="Times New Roman"/>
@@ -86,7 +86,7 @@
         <w:spacing w:after="0"/>
         <w:jc w:val="center"/>
       </w:pPr>
-      <w:hyperlink w:history="1" r:id="rId3m4dzk59imnlnd22zmuxo">
+      <w:hyperlink w:history="1" r:id="rId4mfmklhhvwmhibgvysak4">
         <w:r>
           <w:rPr>
             <w:rFonts w:ascii="Times New Roman" w:cs="Times New Roman" w:eastAsia="Times New Roman" w:hAnsi="Times New Roman"/>
@@ -105,7 +105,7 @@
         </w:rPr>
         <w:t xml:space="preserve">  •  </w:t>
       </w:r>
-      <w:hyperlink w:history="1" r:id="rIdtbsfclu9ftrxlr5gxiz2y">
+      <w:hyperlink w:history="1" r:id="rIdohubdfvyny4lrpy8sjoex">
         <w:r>
           <w:rPr>
             <w:rFonts w:ascii="Times New Roman" w:cs="Times New Roman" w:eastAsia="Times New Roman" w:hAnsi="Times New Roman"/>
@@ -124,7 +124,7 @@
         </w:rPr>
         <w:t xml:space="preserve">  •  </w:t>
       </w:r>
-      <w:hyperlink w:history="1" r:id="rId8xe_mleyeylr88b-fetwe">
+      <w:hyperlink w:history="1" r:id="rIdytyivantfxi5drnq-u3yq">
         <w:r>
           <w:rPr>
             <w:rFonts w:ascii="Times New Roman" w:cs="Times New Roman" w:eastAsia="Times New Roman" w:hAnsi="Times New Roman"/>
@@ -143,7 +143,7 @@
         </w:rPr>
         <w:t xml:space="preserve">  •  </w:t>
       </w:r>
-      <w:hyperlink w:history="1" r:id="rIdrdeii-ghqoeypkq18kzur">
+      <w:hyperlink w:history="1" r:id="rId6oax7e7q0r-u_dkjwadv6">
         <w:r>
           <w:rPr>
             <w:rFonts w:ascii="Times New Roman" w:cs="Times New Roman" w:eastAsia="Times New Roman" w:hAnsi="Times New Roman"/>
@@ -182,7 +182,7 @@
           <w:sz w:val="20"/>
           <w:szCs w:val="20"/>
         </w:rPr>
-        <w:t xml:space="preserve">Reliable testing and verification for AI coding agents in production: LLM-based test generation from recovered specifications, and the evaluation of AI-generated tests. </w:t>
+        <w:t xml:space="preserve">Reliable testing and verification for AI coding agents: LLM-based test generation from recovered specifications, and the evaluation of AI-generated tests. </w:t>
       </w:r>
       <w:r>
         <w:rPr>
@@ -771,7 +771,7 @@
         </w:rPr>
         <w:t xml:space="preserve"> </w:t>
       </w:r>
-      <w:hyperlink w:history="1" r:id="rIdla2vvzl2f7un68x3jk5mq">
+      <w:hyperlink w:history="1" r:id="rIdmvcqo5rsyqw2mwn1uy1qj">
         <w:r>
           <w:rPr>
             <w:rFonts w:ascii="Times New Roman" w:cs="Times New Roman" w:eastAsia="Times New Roman" w:hAnsi="Times New Roman"/>
@@ -835,7 +835,7 @@
         </w:rPr>
         <w:t xml:space="preserve">. </w:t>
       </w:r>
-      <w:hyperlink w:history="1" r:id="rId_ykerfoodhykx0tdqnaqj">
+      <w:hyperlink w:history="1" r:id="rIdmny--g9ko1y2yx4zpu2ey">
         <w:r>
           <w:rPr>
             <w:rFonts w:ascii="Times New Roman" w:cs="Times New Roman" w:eastAsia="Times New Roman" w:hAnsi="Times New Roman"/>
@@ -899,7 +899,7 @@
         </w:rPr>
         <w:t xml:space="preserve">, 2025. </w:t>
       </w:r>
-      <w:hyperlink w:history="1" r:id="rIdxlvudaq-1kci6vnbpr6lr">
+      <w:hyperlink w:history="1" r:id="rId_3xpk-b5sbt-ub78cyvzz">
         <w:r>
           <w:rPr>
             <w:rFonts w:ascii="Times New Roman" w:cs="Times New Roman" w:eastAsia="Times New Roman" w:hAnsi="Times New Roman"/>
@@ -979,7 +979,7 @@
         </w:rPr>
         <w:t xml:space="preserve"> </w:t>
       </w:r>
-      <w:hyperlink w:history="1" r:id="rIdet4sqeblskhcqvqapbrge">
+      <w:hyperlink w:history="1" r:id="rId3wnxr6rhqvufib4rojxg-">
         <w:r>
           <w:rPr>
             <w:rFonts w:ascii="Times New Roman" w:cs="Times New Roman" w:eastAsia="Times New Roman" w:hAnsi="Times New Roman"/>
@@ -1043,7 +1043,7 @@
         </w:rPr>
         <w:t xml:space="preserve">. </w:t>
       </w:r>
-      <w:hyperlink w:history="1" r:id="rIdvnnpvlfuiu0p8awan91gv">
+      <w:hyperlink w:history="1" r:id="rIdctv9xsrpzw0xhej6aq296">
         <w:r>
           <w:rPr>
             <w:rFonts w:ascii="Times New Roman" w:cs="Times New Roman" w:eastAsia="Times New Roman" w:hAnsi="Times New Roman"/>

</xml_diff>

<commit_message>
CV: broaden research interests line
Co-Authored-By: Claude Opus 5.5 <noreply@anthropic.com>
</commit_message>
<xml_diff>
--- a/jundazhao_CV.docx
+++ b/jundazhao_CV.docx
@@ -50,7 +50,7 @@
         </w:rPr>
         <w:t xml:space="preserve">Toronto, ON, Canada  •  </w:t>
       </w:r>
-      <w:hyperlink w:history="1" r:id="rIdxpo34kbsylt2inyqvpdcg">
+      <w:hyperlink w:history="1" r:id="rIdx0czdxnuzuzzots8n40vw">
         <w:r>
           <w:rPr>
             <w:rFonts w:ascii="Times New Roman" w:cs="Times New Roman" w:eastAsia="Times New Roman" w:hAnsi="Times New Roman"/>
@@ -69,7 +69,7 @@
         </w:rPr>
         <w:t xml:space="preserve">  •  </w:t>
       </w:r>
-      <w:hyperlink w:history="1" r:id="rIdzi678by5k84dz5fhgawpz">
+      <w:hyperlink w:history="1" r:id="rId2c4zndgqens2-ma8kt5z_">
         <w:r>
           <w:rPr>
             <w:rFonts w:ascii="Times New Roman" w:cs="Times New Roman" w:eastAsia="Times New Roman" w:hAnsi="Times New Roman"/>
@@ -86,7 +86,7 @@
         <w:spacing w:after="0"/>
         <w:jc w:val="center"/>
       </w:pPr>
-      <w:hyperlink w:history="1" r:id="rId4mfmklhhvwmhibgvysak4">
+      <w:hyperlink w:history="1" r:id="rIdft8uukvaspkc_nyzn7fzl">
         <w:r>
           <w:rPr>
             <w:rFonts w:ascii="Times New Roman" w:cs="Times New Roman" w:eastAsia="Times New Roman" w:hAnsi="Times New Roman"/>
@@ -105,7 +105,7 @@
         </w:rPr>
         <w:t xml:space="preserve">  •  </w:t>
       </w:r>
-      <w:hyperlink w:history="1" r:id="rIdohubdfvyny4lrpy8sjoex">
+      <w:hyperlink w:history="1" r:id="rIdn2uepc1-symiwp3s7ctde">
         <w:r>
           <w:rPr>
             <w:rFonts w:ascii="Times New Roman" w:cs="Times New Roman" w:eastAsia="Times New Roman" w:hAnsi="Times New Roman"/>
@@ -124,7 +124,7 @@
         </w:rPr>
         <w:t xml:space="preserve">  •  </w:t>
       </w:r>
-      <w:hyperlink w:history="1" r:id="rIdytyivantfxi5drnq-u3yq">
+      <w:hyperlink w:history="1" r:id="rIdqotny6ohqphoh28xkzgw8">
         <w:r>
           <w:rPr>
             <w:rFonts w:ascii="Times New Roman" w:cs="Times New Roman" w:eastAsia="Times New Roman" w:hAnsi="Times New Roman"/>
@@ -143,7 +143,7 @@
         </w:rPr>
         <w:t xml:space="preserve">  •  </w:t>
       </w:r>
-      <w:hyperlink w:history="1" r:id="rId6oax7e7q0r-u_dkjwadv6">
+      <w:hyperlink w:history="1" r:id="rIdgdtkaahuz9oot2afztlqg">
         <w:r>
           <w:rPr>
             <w:rFonts w:ascii="Times New Roman" w:cs="Times New Roman" w:eastAsia="Times New Roman" w:hAnsi="Times New Roman"/>
@@ -182,7 +182,7 @@
           <w:sz w:val="20"/>
           <w:szCs w:val="20"/>
         </w:rPr>
-        <w:t xml:space="preserve">Reliable testing and verification for AI coding agents: LLM-based test generation from recovered specifications, and the evaluation of AI-generated tests. </w:t>
+        <w:t xml:space="preserve">Reliable testing and verification for AI coding agents: establishing what code should do, generating tests that expose bugs rather than confirm them, and producing trustworthy evidence that AI-generated software works. </w:t>
       </w:r>
       <w:r>
         <w:rPr>
@@ -771,7 +771,7 @@
         </w:rPr>
         <w:t xml:space="preserve"> </w:t>
       </w:r>
-      <w:hyperlink w:history="1" r:id="rIdmvcqo5rsyqw2mwn1uy1qj">
+      <w:hyperlink w:history="1" r:id="rIdrnjmd4ejfysmxoc2uxmje">
         <w:r>
           <w:rPr>
             <w:rFonts w:ascii="Times New Roman" w:cs="Times New Roman" w:eastAsia="Times New Roman" w:hAnsi="Times New Roman"/>
@@ -835,7 +835,7 @@
         </w:rPr>
         <w:t xml:space="preserve">. </w:t>
       </w:r>
-      <w:hyperlink w:history="1" r:id="rIdmny--g9ko1y2yx4zpu2ey">
+      <w:hyperlink w:history="1" r:id="rIdnppshuduyvddyvl3m9x8z">
         <w:r>
           <w:rPr>
             <w:rFonts w:ascii="Times New Roman" w:cs="Times New Roman" w:eastAsia="Times New Roman" w:hAnsi="Times New Roman"/>
@@ -899,7 +899,7 @@
         </w:rPr>
         <w:t xml:space="preserve">, 2025. </w:t>
       </w:r>
-      <w:hyperlink w:history="1" r:id="rId_3xpk-b5sbt-ub78cyvzz">
+      <w:hyperlink w:history="1" r:id="rIdhfjmtk0nq1c_jtdkioby0">
         <w:r>
           <w:rPr>
             <w:rFonts w:ascii="Times New Roman" w:cs="Times New Roman" w:eastAsia="Times New Roman" w:hAnsi="Times New Roman"/>
@@ -979,7 +979,7 @@
         </w:rPr>
         <w:t xml:space="preserve"> </w:t>
       </w:r>
-      <w:hyperlink w:history="1" r:id="rId3wnxr6rhqvufib4rojxg-">
+      <w:hyperlink w:history="1" r:id="rIdxyfr2jnbwqrxjtei5jbmy">
         <w:r>
           <w:rPr>
             <w:rFonts w:ascii="Times New Roman" w:cs="Times New Roman" w:eastAsia="Times New Roman" w:hAnsi="Times New Roman"/>
@@ -1043,7 +1043,7 @@
         </w:rPr>
         <w:t xml:space="preserve">. </w:t>
       </w:r>
-      <w:hyperlink w:history="1" r:id="rIdctv9xsrpzw0xhej6aq296">
+      <w:hyperlink w:history="1" r:id="rIdbj7wepo-vvv1ohntbl_ka">
         <w:r>
           <w:rPr>
             <w:rFonts w:ascii="Times New Roman" w:cs="Times New Roman" w:eastAsia="Times New Roman" w:hAnsi="Times New Roman"/>

</xml_diff>

<commit_message>
CV: more formal research interests line
Co-Authored-By: Claude Opus 5.5 <noreply@anthropic.com>
</commit_message>
<xml_diff>
--- a/jundazhao_CV.docx
+++ b/jundazhao_CV.docx
@@ -50,7 +50,7 @@
         </w:rPr>
         <w:t xml:space="preserve">Toronto, ON, Canada  •  </w:t>
       </w:r>
-      <w:hyperlink w:history="1" r:id="rIdx0czdxnuzuzzots8n40vw">
+      <w:hyperlink w:history="1" r:id="rIdnpmif4i9ttdudwwpd2ii8">
         <w:r>
           <w:rPr>
             <w:rFonts w:ascii="Times New Roman" w:cs="Times New Roman" w:eastAsia="Times New Roman" w:hAnsi="Times New Roman"/>
@@ -69,7 +69,7 @@
         </w:rPr>
         <w:t xml:space="preserve">  •  </w:t>
       </w:r>
-      <w:hyperlink w:history="1" r:id="rId2c4zndgqens2-ma8kt5z_">
+      <w:hyperlink w:history="1" r:id="rIdeokd1yzf4ask0ywscolvw">
         <w:r>
           <w:rPr>
             <w:rFonts w:ascii="Times New Roman" w:cs="Times New Roman" w:eastAsia="Times New Roman" w:hAnsi="Times New Roman"/>
@@ -86,7 +86,7 @@
         <w:spacing w:after="0"/>
         <w:jc w:val="center"/>
       </w:pPr>
-      <w:hyperlink w:history="1" r:id="rIdft8uukvaspkc_nyzn7fzl">
+      <w:hyperlink w:history="1" r:id="rIddtqttb0v1gd2rw8j4rjwh">
         <w:r>
           <w:rPr>
             <w:rFonts w:ascii="Times New Roman" w:cs="Times New Roman" w:eastAsia="Times New Roman" w:hAnsi="Times New Roman"/>
@@ -105,7 +105,7 @@
         </w:rPr>
         <w:t xml:space="preserve">  •  </w:t>
       </w:r>
-      <w:hyperlink w:history="1" r:id="rIdn2uepc1-symiwp3s7ctde">
+      <w:hyperlink w:history="1" r:id="rIdmavbiw22g9zbijxa8ldfc">
         <w:r>
           <w:rPr>
             <w:rFonts w:ascii="Times New Roman" w:cs="Times New Roman" w:eastAsia="Times New Roman" w:hAnsi="Times New Roman"/>
@@ -124,7 +124,7 @@
         </w:rPr>
         <w:t xml:space="preserve">  •  </w:t>
       </w:r>
-      <w:hyperlink w:history="1" r:id="rIdqotny6ohqphoh28xkzgw8">
+      <w:hyperlink w:history="1" r:id="rIdqowqx6iq1rbd_yfi1buym">
         <w:r>
           <w:rPr>
             <w:rFonts w:ascii="Times New Roman" w:cs="Times New Roman" w:eastAsia="Times New Roman" w:hAnsi="Times New Roman"/>
@@ -143,7 +143,7 @@
         </w:rPr>
         <w:t xml:space="preserve">  •  </w:t>
       </w:r>
-      <w:hyperlink w:history="1" r:id="rIdgdtkaahuz9oot2afztlqg">
+      <w:hyperlink w:history="1" r:id="rIdcamh6sr5lcqfvyic9ultm">
         <w:r>
           <w:rPr>
             <w:rFonts w:ascii="Times New Roman" w:cs="Times New Roman" w:eastAsia="Times New Roman" w:hAnsi="Times New Roman"/>
@@ -182,7 +182,7 @@
           <w:sz w:val="20"/>
           <w:szCs w:val="20"/>
         </w:rPr>
-        <w:t xml:space="preserve">Reliable testing and verification for AI coding agents: establishing what code should do, generating tests that expose bugs rather than confirm them, and producing trustworthy evidence that AI-generated software works. </w:t>
+        <w:t xml:space="preserve">Reliable testing and verification for AI coding agents: establishing the intended behavior of code, generating bug-revealing tests, and assessing the correctness of AI-generated software. </w:t>
       </w:r>
       <w:r>
         <w:rPr>
@@ -771,7 +771,7 @@
         </w:rPr>
         <w:t xml:space="preserve"> </w:t>
       </w:r>
-      <w:hyperlink w:history="1" r:id="rIdrnjmd4ejfysmxoc2uxmje">
+      <w:hyperlink w:history="1" r:id="rIdwbrgc4n5jzhhrn0lsgzql">
         <w:r>
           <w:rPr>
             <w:rFonts w:ascii="Times New Roman" w:cs="Times New Roman" w:eastAsia="Times New Roman" w:hAnsi="Times New Roman"/>
@@ -835,7 +835,7 @@
         </w:rPr>
         <w:t xml:space="preserve">. </w:t>
       </w:r>
-      <w:hyperlink w:history="1" r:id="rIdnppshuduyvddyvl3m9x8z">
+      <w:hyperlink w:history="1" r:id="rIdlh9rqfte973aresiagprd">
         <w:r>
           <w:rPr>
             <w:rFonts w:ascii="Times New Roman" w:cs="Times New Roman" w:eastAsia="Times New Roman" w:hAnsi="Times New Roman"/>
@@ -899,7 +899,7 @@
         </w:rPr>
         <w:t xml:space="preserve">, 2025. </w:t>
       </w:r>
-      <w:hyperlink w:history="1" r:id="rIdhfjmtk0nq1c_jtdkioby0">
+      <w:hyperlink w:history="1" r:id="rIdtvizyrfo0rhbm14gm2o6e">
         <w:r>
           <w:rPr>
             <w:rFonts w:ascii="Times New Roman" w:cs="Times New Roman" w:eastAsia="Times New Roman" w:hAnsi="Times New Roman"/>
@@ -979,7 +979,7 @@
         </w:rPr>
         <w:t xml:space="preserve"> </w:t>
       </w:r>
-      <w:hyperlink w:history="1" r:id="rIdxyfr2jnbwqrxjtei5jbmy">
+      <w:hyperlink w:history="1" r:id="rIdz2h7cgotlj2stybfw4gff">
         <w:r>
           <w:rPr>
             <w:rFonts w:ascii="Times New Roman" w:cs="Times New Roman" w:eastAsia="Times New Roman" w:hAnsi="Times New Roman"/>
@@ -1043,7 +1043,7 @@
         </w:rPr>
         <w:t xml:space="preserve">. </w:t>
       </w:r>
-      <w:hyperlink w:history="1" r:id="rIdbj7wepo-vvv1ohntbl_ka">
+      <w:hyperlink w:history="1" r:id="rId0kr20iu-_-xqtv-jyfy-k">
         <w:r>
           <w:rPr>
             <w:rFonts w:ascii="Times New Roman" w:cs="Times New Roman" w:eastAsia="Times New Roman" w:hAnsi="Times New Roman"/>

</xml_diff>

<commit_message>
CV: fuller, more formal research interests line
Co-Authored-By: Claude Opus 5.5 <noreply@anthropic.com>
</commit_message>
<xml_diff>
--- a/jundazhao_CV.docx
+++ b/jundazhao_CV.docx
@@ -50,7 +50,7 @@
         </w:rPr>
         <w:t xml:space="preserve">Toronto, ON, Canada  •  </w:t>
       </w:r>
-      <w:hyperlink w:history="1" r:id="rIdnpmif4i9ttdudwwpd2ii8">
+      <w:hyperlink w:history="1" r:id="rIdtphau-cnljcl9afyl_buj">
         <w:r>
           <w:rPr>
             <w:rFonts w:ascii="Times New Roman" w:cs="Times New Roman" w:eastAsia="Times New Roman" w:hAnsi="Times New Roman"/>
@@ -69,7 +69,7 @@
         </w:rPr>
         <w:t xml:space="preserve">  •  </w:t>
       </w:r>
-      <w:hyperlink w:history="1" r:id="rIdeokd1yzf4ask0ywscolvw">
+      <w:hyperlink w:history="1" r:id="rIdyovs2xrhvw31gidgtghyg">
         <w:r>
           <w:rPr>
             <w:rFonts w:ascii="Times New Roman" w:cs="Times New Roman" w:eastAsia="Times New Roman" w:hAnsi="Times New Roman"/>
@@ -86,7 +86,7 @@
         <w:spacing w:after="0"/>
         <w:jc w:val="center"/>
       </w:pPr>
-      <w:hyperlink w:history="1" r:id="rIddtqttb0v1gd2rw8j4rjwh">
+      <w:hyperlink w:history="1" r:id="rIdum6ucfulejadlf-3ocovn">
         <w:r>
           <w:rPr>
             <w:rFonts w:ascii="Times New Roman" w:cs="Times New Roman" w:eastAsia="Times New Roman" w:hAnsi="Times New Roman"/>
@@ -105,7 +105,7 @@
         </w:rPr>
         <w:t xml:space="preserve">  •  </w:t>
       </w:r>
-      <w:hyperlink w:history="1" r:id="rIdmavbiw22g9zbijxa8ldfc">
+      <w:hyperlink w:history="1" r:id="rId9x-aoxup7skh7tdv9rny4">
         <w:r>
           <w:rPr>
             <w:rFonts w:ascii="Times New Roman" w:cs="Times New Roman" w:eastAsia="Times New Roman" w:hAnsi="Times New Roman"/>
@@ -124,7 +124,7 @@
         </w:rPr>
         <w:t xml:space="preserve">  •  </w:t>
       </w:r>
-      <w:hyperlink w:history="1" r:id="rIdqowqx6iq1rbd_yfi1buym">
+      <w:hyperlink w:history="1" r:id="rIdsotonwew3z0xxvhsyi53d">
         <w:r>
           <w:rPr>
             <w:rFonts w:ascii="Times New Roman" w:cs="Times New Roman" w:eastAsia="Times New Roman" w:hAnsi="Times New Roman"/>
@@ -143,7 +143,7 @@
         </w:rPr>
         <w:t xml:space="preserve">  •  </w:t>
       </w:r>
-      <w:hyperlink w:history="1" r:id="rIdcamh6sr5lcqfvyic9ultm">
+      <w:hyperlink w:history="1" r:id="rIdsgh2-y8iyrbwfilha1_wk">
         <w:r>
           <w:rPr>
             <w:rFonts w:ascii="Times New Roman" w:cs="Times New Roman" w:eastAsia="Times New Roman" w:hAnsi="Times New Roman"/>
@@ -182,7 +182,7 @@
           <w:sz w:val="20"/>
           <w:szCs w:val="20"/>
         </w:rPr>
-        <w:t xml:space="preserve">Reliable testing and verification for AI coding agents: establishing the intended behavior of code, generating bug-revealing tests, and assessing the correctness of AI-generated software. </w:t>
+        <w:t xml:space="preserve">Reliable testing and verification for AI coding agents, with an emphasis on establishing the intended behavior of code when the implementation itself may be incorrect, generating tests that reveal defects rather than encode them, and assessing whether the evidence used to validate AI-generated software can be trusted. </w:t>
       </w:r>
       <w:r>
         <w:rPr>
@@ -771,7 +771,7 @@
         </w:rPr>
         <w:t xml:space="preserve"> </w:t>
       </w:r>
-      <w:hyperlink w:history="1" r:id="rIdwbrgc4n5jzhhrn0lsgzql">
+      <w:hyperlink w:history="1" r:id="rIdo20ropmokwhgnsftoxkxj">
         <w:r>
           <w:rPr>
             <w:rFonts w:ascii="Times New Roman" w:cs="Times New Roman" w:eastAsia="Times New Roman" w:hAnsi="Times New Roman"/>
@@ -835,7 +835,7 @@
         </w:rPr>
         <w:t xml:space="preserve">. </w:t>
       </w:r>
-      <w:hyperlink w:history="1" r:id="rIdlh9rqfte973aresiagprd">
+      <w:hyperlink w:history="1" r:id="rIdnwahp-bhp-6tlhh5n8zyz">
         <w:r>
           <w:rPr>
             <w:rFonts w:ascii="Times New Roman" w:cs="Times New Roman" w:eastAsia="Times New Roman" w:hAnsi="Times New Roman"/>
@@ -899,7 +899,7 @@
         </w:rPr>
         <w:t xml:space="preserve">, 2025. </w:t>
       </w:r>
-      <w:hyperlink w:history="1" r:id="rIdtvizyrfo0rhbm14gm2o6e">
+      <w:hyperlink w:history="1" r:id="rIduetms6swyysld73wrh0c_">
         <w:r>
           <w:rPr>
             <w:rFonts w:ascii="Times New Roman" w:cs="Times New Roman" w:eastAsia="Times New Roman" w:hAnsi="Times New Roman"/>
@@ -979,7 +979,7 @@
         </w:rPr>
         <w:t xml:space="preserve"> </w:t>
       </w:r>
-      <w:hyperlink w:history="1" r:id="rIdz2h7cgotlj2stybfw4gff">
+      <w:hyperlink w:history="1" r:id="rIdxxgd6c8akwybjmxgqfo6m">
         <w:r>
           <w:rPr>
             <w:rFonts w:ascii="Times New Roman" w:cs="Times New Roman" w:eastAsia="Times New Roman" w:hAnsi="Times New Roman"/>
@@ -1043,7 +1043,7 @@
         </w:rPr>
         <w:t xml:space="preserve">. </w:t>
       </w:r>
-      <w:hyperlink w:history="1" r:id="rId0kr20iu-_-xqtv-jyfy-k">
+      <w:hyperlink w:history="1" r:id="rIdxlcnbx1nst9kig0fixwde">
         <w:r>
           <w:rPr>
             <w:rFonts w:ascii="Times New Roman" w:cs="Times New Roman" w:eastAsia="Times New Roman" w:hAnsi="Times New Roman"/>

</xml_diff>